<commit_message>
Ajout du projet local au repo GitHub
</commit_message>
<xml_diff>
--- a/Enhanced_GDD_Full.docx
+++ b/Enhanced_GDD_Full.docx
@@ -8,10 +8,10 @@
         <w:jc w:val="left"/>
       </w:pPr>
       <w:r>
-        <w:t>Lexika's Linguistic Quest: A Dyslexia-Friendly Adventure</w:t>
+        <w:t>Lexika's Quest: A Dyslexia-Friendly French Adventure</w:t>
         <w:br/>
         <w:br/>
-        <w:t>ORIGINAL_CONCEPT: An educational game where players explore a magical world, Lexika, and solve linguistic puzzles to restore its magic, focusing on French language learning for children aged 6-10.</w:t>
+        <w:t>ORIGINAL_CONCEPT: An educational mobile and PC game that makes learning French fun, immersive, and motivating for children aged 6-10 through an exploratory universe and the Octalysis Framework.</w:t>
       </w:r>
     </w:p>
     <w:p>
@@ -42,7 +42,7 @@
         <w:pStyle w:val="ListBullet"/>
       </w:pPr>
       <w:r>
-        <w:t>• - Integrate a stronger social component to foster collaboration and friendly competition, such as collaborative puzzles or shared island creation.</w:t>
+        <w:t>• - Integrate more robust social features, like collaborative mini-games or a shared world map, to enhance Social Influence &amp; Relatedness.</w:t>
       </w:r>
     </w:p>
     <w:p>
@@ -50,7 +50,7 @@
         <w:pStyle w:val="ListBullet"/>
       </w:pPr>
       <w:r>
-        <w:t>• - Enhance the "Loss &amp; Avoidance" aspect by introducing timed challenges with escalating consequences for failure, making the learning process more engaging and impactful.</w:t>
+        <w:t>• - Implement variable reward schedules and rare, powerful items to intensify Scarcity &amp; Impatience and Unpredictability &amp; Curiosity.</w:t>
       </w:r>
     </w:p>
     <w:p>
@@ -58,7 +58,7 @@
         <w:pStyle w:val="ListBullet"/>
       </w:pPr>
       <w:r>
-        <w:t>• - Provide more diverse and challenging content in the endgame to sustain long-term player engagement and continuous improvement in language skills.</w:t>
+        <w:t>• - Introduce a crafting system to encourage Ownership &amp; Possession and Empowerment of Creativity &amp; Feedback.</w:t>
       </w:r>
     </w:p>
     <w:p>
@@ -72,7 +72,7 @@
     </w:p>
     <w:p>
       <w:r>
-        <w:t>"Lexika's Linguistic Quest" is an educational adventure game designed to make learning French fun and immersive for children with or without dyslexia. By utilizing the Octalysis Framework, the game effectively motivates players through exploration, achievement, creativity, and a compelling narrative. The game could further improve its appeal by strengthening its social elements and addressing "Loss &amp; Avoidance" Core Drive.</w:t>
+        <w:t>"Lexika's Quest" is an educational adventure game designed to support children with dyslexia in learning French. The game effectively utilizes the Octalysis Framework to create an engaging and motivating learning experience, leveraging exploration, mini-games, and a compelling narrative. Further enhancements to social elements, reward systems, and personalized learning paths can significantly improve the game's overall appeal and effectiveness.</w:t>
       </w:r>
     </w:p>
     <w:p>
@@ -86,7 +86,7 @@
     </w:p>
     <w:p>
       <w:r>
-        <w:t>An educational game where players explore a magical world, Lexika, and solve linguistic puzzles to restore its magic, focusing on French language learning for children aged 6-10.</w:t>
+        <w:t>An educational mobile and PC game that makes learning French fun, immersive, and motivating for children aged 6-10 through an exploratory universe and the Octalysis Framework.</w:t>
       </w:r>
     </w:p>
     <w:p>
@@ -100,59 +100,55 @@
     </w:p>
     <w:p>
       <w:r>
-        <w:t>"Lexika's Linguistic Quest" transforms French language learning into an engaging adventure, tailored for children aged 6-10. Players become linguistic heroes, exploring themed islands, mastering letters, sounds, and words, and restoring the magic of Lexika. By integrating Octalysis principles, the game provides continuous motivation through a captivating narrative, rewarding progression, creative opportunities, and social interactions, while dyslexia-friendly features ensure accessibility for all players.</w:t>
+        <w:t>"Lexika's Quest" transforms French language learning into an exciting adventure within the magical world of Lexika. As a young linguistic explorer, players embark on quests across themed islands, solving educational challenges to restore the language's magic. The game incorporates elements of exploration, mini-games, avatar customization, and collection to engage players and promote natural progression while making learning an enjoyable experience tailored for children with dyslexia.</w:t>
         <w:br/>
         <w:br/>
         <w:t>CORE_MECHANICS:</w:t>
         <w:br/>
-        <w:t>- Island Exploration: Players navigate themed islands, each focusing on a specific aspect of the French language (e.g., vowels, consonants, syllables, words). (ties to [Core Drive] - Unpredictability &amp; Curiosity)</w:t>
+        <w:t>- Island Exploration: Players navigate a side-scrolling map of Lexika, discovering new islands and challenges (ties to Core Drive 7: Unpredictability &amp; Curiosity).</w:t>
         <w:br/>
-        <w:t>- Mini-Game Challenges: Engaging mini-games such as "Associate the sound with the letter" or "Assemble des bulles sonores" reinforce learning through interactive play. (ties to [Core Drive] - Development &amp; Accomplishment)</w:t>
+        <w:t>- Mini-Game Challenges: Each island features multiple mini-games focused on specific language skills (phonics, vocabulary, grammar) (ties to Core Drive 2: Development &amp; Accomplishment).</w:t>
         <w:br/>
-        <w:t>- Avatar Customization: Players personalize their in-game avatar with various accessories and outfits earned through gameplay, promoting creativity and ownership. (ties to [Core Drive] - Empowerment of Creativity &amp; Feedback, Ownership &amp; Possession)</w:t>
+        <w:t>- Avatar Customization: Players can personalize their character with unlockable items and accessories, expressing their creativity (ties to Core Drive 3: Empowerment of Creativity &amp; Feedback).</w:t>
         <w:br/>
-        <w:t>- Linguistic Duels: Players can challenge each other to linguistic duels, answering questions on learned concepts. (ties to [Core Drive] - Social Influence &amp; Relatedness, Development &amp; Accomplishment)</w:t>
+        <w:t>- Lexika Restoration: Completing islands visually restores Lexika to its colorful state (ties to Core Drive 1: Epic Meaning &amp; Calling).</w:t>
         <w:br/>
         <w:br/>
         <w:t>PROGRESSION_SYSTEM:</w:t>
         <w:br/>
-        <w:t>The progression system is structured around the island-based exploration. Each island presents a series of mini-games and challenges that players must complete to "restore" that area of Lexika. The completion of each island unlocks new content, including:</w:t>
+        <w:t>The game utilizes a multi-layered progression system:</w:t>
         <w:br/>
-        <w:t>- New Islands: Unlocking new themed islands increases challenge and expands the learning scope. (Unpredictability &amp; Curiosity)</w:t>
+        <w:t>- **Island Completion:** Clearing each island unlocks new islands and story segments, fueling exploration (Core Drive 7: Unpredictability &amp; Curiosity).</w:t>
         <w:br/>
-        <w:t>- New Avatar Items: Avatar customization options are a tangible reward, increasing ownership. (Ownership &amp; Possession)</w:t>
+        <w:t>- **Skill Mastery:** Mini-games offer star ratings based on performance, encouraging improvement and mastery (Core Drive 2: Development &amp; Accomplishment).</w:t>
         <w:br/>
-        <w:t>- Explorer Rank: A visible rank (Beginner, Intermediate, Advanced, Master) reflects the player's overall progress and mastery. (Development &amp; Accomplishment)</w:t>
+        <w:t>- **Explorer Level:** Experience points earned from mini-games contribute to the player's Explorer Level, unlocking badges and titles (Beginner to Master) (Core Drive 2: Development &amp; Accomplishment).</w:t>
         <w:br/>
-        <w:t>- Story Unlocks: As players progress, they uncover hidden storylines and lore within Lexika, adding depth and Epic Meaning. (Epic Meaning &amp; Calling)</w:t>
+        <w:t>- **Collection &amp; Crafting:** Players collect letters, sounds, and words, which can be used to craft special items or unlock hidden content (Core Drive 4: Ownership &amp; Possession and Core Drive 3: Empowerment of Creativity &amp; Feedback).</w:t>
         <w:br/>
-        <w:t>- Daily Quests: Offer players daily goals (e.g. complete 3 mini-games), providing a consistent Development &amp; Accomplishment loop.</w:t>
-        <w:br/>
-        <w:t>- Timed Challenges: Introduce challenges with time limits, adding a "Loss &amp; Avoidance" element. Failing to complete within the time limit could result in temporary penalties, like losing bonus points.</w:t>
+        <w:t>- **Carnet de l’Explorateur Linguistique:** Players collect badges, objects and words to enrich and track progression. (Core Drive 2: Development &amp; Accomplishment)</w:t>
         <w:br/>
         <w:br/>
         <w:t>REWARD_SYSTEMS:</w:t>
         <w:br/>
-        <w:t>- Badges and Achievements: Awarded for completing specific tasks or reaching milestones, driving Development &amp; Accomplishment. (motivates Development &amp; Accomplishment)</w:t>
+        <w:t>- Badges and Titles: Awarded for achieving milestones and reaching new Explorer Levels, providing a sense of accomplishment and status (motivates Core Drive 2: Development &amp; Accomplishment).</w:t>
         <w:br/>
-        <w:t>- Currency and Items: Players earn in-game currency (LexiCoins) and unique items (e.g., rare letters, magical sounds) that can be used for avatar customization or unlocking special features, enhancing Ownership &amp; Possession and Scarcity &amp; Impatience. (motivates Ownership &amp; Possession, Scarcity &amp; Impatience)</w:t>
+        <w:t>- Cosmetic Items: Unlockable avatar accessories and decorations provide a sense of ownership and personalization (motivates Core Drive 4: Ownership &amp; Possession and Core Drive 3: Empowerment of Creativity &amp; Feedback).</w:t>
         <w:br/>
-        <w:t>- Story Unlocks and Cinematics: Each island completion triggers an animated cinematic that visually transforms the environment, offering a rewarding visual and narrative payoff, reinforcing Epic Meaning &amp; Calling. (motivates Epic Meaning &amp; Calling)</w:t>
+        <w:t>- Story Unlocks: Unlocking hidden stories and lore fragments deepens the narrative and provides a sense of discovery (motivates Core Drive 7: Unpredictability &amp; Curiosity and Core Drive 1: Epic Meaning &amp; Calling).</w:t>
         <w:br/>
-        <w:t>- LexiLoot Boxes: Introduce loot boxes containing random avatar items or boosts, making the reward system more unpredictable and exciting. The appearance of these lootboxes can be made scarce, making the players more eager to open the boxes when they find them. (motivates Unpredictability &amp; Curiosity, Scarcity &amp; Impatience)</w:t>
+        <w:t>- Rare Items: Special letters or sounds could be used to create powerful unique cosmetic items (motivates Core Drive 6: Scarcity &amp; Impatience).</w:t>
         <w:br/>
         <w:br/>
         <w:t>SOCIAL_ELEMENTS:</w:t>
         <w:br/>
-        <w:t>- Collaborative Puzzles: Islands feature puzzles that require multiple players to solve, fostering teamwork and communication. (supports Social Influence &amp; Relatedness)</w:t>
+        <w:t>- Leaderboards: Showcasing top Explorer Levels and mini-game scores, fostering friendly competition (supports Core Drive 5: Social Influence &amp; Relatedness).</w:t>
         <w:br/>
-        <w:t>- Shared Island Creation: Players can collaborate to build and decorate their own islands, showcasing their creativity and fostering a sense of community. (supports Empowerment of Creativity &amp; Feedback, Social Influence &amp; Relatedness)</w:t>
+        <w:t>- Collaborative Mini-Games: Multiplayer challenges where players work together to solve language puzzles (supports Core Drive 5: Social Influence &amp; Relatedness).</w:t>
         <w:br/>
-        <w:t>- Gifting System: Players can send gifts to friends, such as avatar items or LexiCoins, encouraging social interaction and reciprocity. (supports Social Influence &amp; Relatedness, Ownership &amp; Possession)</w:t>
+        <w:t>- Shared World Map: A visual representation of Lexika where players can see other players' progress and accomplishments (supports Core Drive 5: Social Influence &amp; Relatedness).</w:t>
         <w:br/>
-        <w:t>- Linguistic Duels: Challenge friends to French language quizzes to showcase your expertise. (supports Development &amp; Accomplishment, Social Influence &amp; Relatedness, Competitiveness)</w:t>
-        <w:br/>
-        <w:t>- Leaderboards: Display progress compared to friends (supports Social Influence &amp; Relatedness, Competitiveness)</w:t>
+        <w:t>- Gifting: Enable players to send cosmetic items to one another. (supports Core Drive 5: Social Influence &amp; Relatedness).</w:t>
         <w:br/>
         <w:br/>
         <w:t>PLAYER_JOURNEY:</w:t>
@@ -172,7 +168,7 @@
         <w:pStyle w:val="ListBullet"/>
       </w:pPr>
       <w:r>
-        <w:t>• - Island Exploration: Players navigate themed islands, each focusing on a specific aspect of the French language (e.g., vowels, consonants, syllables, words). (ties to [Core Drive] - Unpredictability &amp; Curiosity)</w:t>
+        <w:t>• - Island Exploration: Players navigate a side-scrolling map of Lexika, discovering new islands and challenges (ties to Core Drive 7: Unpredictability &amp; Curiosity).</w:t>
       </w:r>
     </w:p>
     <w:p>
@@ -180,7 +176,7 @@
         <w:pStyle w:val="ListBullet"/>
       </w:pPr>
       <w:r>
-        <w:t>• - Mini-Game Challenges: Engaging mini-games such as "Associate the sound with the letter" or "Assemble des bulles sonores" reinforce learning through interactive play. (ties to [Core Drive] - Development &amp; Accomplishment)</w:t>
+        <w:t>• - Mini-Game Challenges: Each island features multiple mini-games focused on specific language skills (phonics, vocabulary, grammar) (ties to Core Drive 2: Development &amp; Accomplishment).</w:t>
       </w:r>
     </w:p>
     <w:p>
@@ -188,7 +184,7 @@
         <w:pStyle w:val="ListBullet"/>
       </w:pPr>
       <w:r>
-        <w:t>• - Avatar Customization: Players personalize their in-game avatar with various accessories and outfits earned through gameplay, promoting creativity and ownership. (ties to [Core Drive] - Empowerment of Creativity &amp; Feedback, Ownership &amp; Possession)</w:t>
+        <w:t>• - Avatar Customization: Players can personalize their character with unlockable items and accessories, expressing their creativity (ties to Core Drive 3: Empowerment of Creativity &amp; Feedback).</w:t>
       </w:r>
     </w:p>
     <w:p>
@@ -196,7 +192,7 @@
         <w:pStyle w:val="ListBullet"/>
       </w:pPr>
       <w:r>
-        <w:t>• - Linguistic Duels: Players can challenge each other to linguistic duels, answering questions on learned concepts. (ties to [Core Drive] - Social Influence &amp; Relatedness, Development &amp; Accomplishment)</w:t>
+        <w:t>• - Lexika Restoration: Completing islands visually restores Lexika to its colorful state (ties to Core Drive 1: Epic Meaning &amp; Calling).</w:t>
       </w:r>
     </w:p>
     <w:p>
@@ -212,7 +208,7 @@
         <w:pStyle w:val="ListBullet"/>
       </w:pPr>
       <w:r>
-        <w:t>• The progression system is structured around the island-based exploration. Each island presents a series of mini-games and challenges that players must complete to "restore" that area of Lexika. The completion of each island unlocks new content, including:</w:t>
+        <w:t>• The game utilizes a multi-layered progression system:</w:t>
       </w:r>
     </w:p>
     <w:p>
@@ -220,7 +216,7 @@
         <w:pStyle w:val="ListBullet"/>
       </w:pPr>
       <w:r>
-        <w:t>• - New Islands: Unlocking new themed islands increases challenge and expands the learning scope. (Unpredictability &amp; Curiosity)</w:t>
+        <w:t>• - **Island Completion:** Clearing each island unlocks new islands and story segments, fueling exploration (Core Drive 7: Unpredictability &amp; Curiosity).</w:t>
       </w:r>
     </w:p>
     <w:p>
@@ -228,7 +224,7 @@
         <w:pStyle w:val="ListBullet"/>
       </w:pPr>
       <w:r>
-        <w:t>• - New Avatar Items: Avatar customization options are a tangible reward, increasing ownership. (Ownership &amp; Possession)</w:t>
+        <w:t>• - **Skill Mastery:** Mini-games offer star ratings based on performance, encouraging improvement and mastery (Core Drive 2: Development &amp; Accomplishment).</w:t>
       </w:r>
     </w:p>
     <w:p>
@@ -236,7 +232,7 @@
         <w:pStyle w:val="ListBullet"/>
       </w:pPr>
       <w:r>
-        <w:t>• - Explorer Rank: A visible rank (Beginner, Intermediate, Advanced, Master) reflects the player's overall progress and mastery. (Development &amp; Accomplishment)</w:t>
+        <w:t>• - **Explorer Level:** Experience points earned from mini-games contribute to the player's Explorer Level, unlocking badges and titles (Beginner to Master) (Core Drive 2: Development &amp; Accomplishment).</w:t>
       </w:r>
     </w:p>
     <w:p>
@@ -244,7 +240,7 @@
         <w:pStyle w:val="ListBullet"/>
       </w:pPr>
       <w:r>
-        <w:t>• - Story Unlocks: As players progress, they uncover hidden storylines and lore within Lexika, adding depth and Epic Meaning. (Epic Meaning &amp; Calling)</w:t>
+        <w:t>• - **Collection &amp; Crafting:** Players collect letters, sounds, and words, which can be used to craft special items or unlock hidden content (Core Drive 4: Ownership &amp; Possession and Core Drive 3: Empowerment of Creativity &amp; Feedback).</w:t>
       </w:r>
     </w:p>
     <w:p>
@@ -252,15 +248,7 @@
         <w:pStyle w:val="ListBullet"/>
       </w:pPr>
       <w:r>
-        <w:t>• - Daily Quests: Offer players daily goals (e.g. complete 3 mini-games), providing a consistent Development &amp; Accomplishment loop.</w:t>
-      </w:r>
-    </w:p>
-    <w:p>
-      <w:pPr>
-        <w:pStyle w:val="ListBullet"/>
-      </w:pPr>
-      <w:r>
-        <w:t>• - Timed Challenges: Introduce challenges with time limits, adding a "Loss &amp; Avoidance" element. Failing to complete within the time limit could result in temporary penalties, like losing bonus points.</w:t>
+        <w:t>• - **Carnet de l’Explorateur Linguistique:** Players collect badges, objects and words to enrich and track progression. (Core Drive 2: Development &amp; Accomplishment)</w:t>
       </w:r>
     </w:p>
     <w:p>
@@ -276,7 +264,7 @@
         <w:pStyle w:val="ListBullet"/>
       </w:pPr>
       <w:r>
-        <w:t>• - Badges and Achievements: Awarded for completing specific tasks or reaching milestones, driving Development &amp; Accomplishment. (motivates Development &amp; Accomplishment)</w:t>
+        <w:t>• - Badges and Titles: Awarded for achieving milestones and reaching new Explorer Levels, providing a sense of accomplishment and status (motivates Core Drive 2: Development &amp; Accomplishment).</w:t>
       </w:r>
     </w:p>
     <w:p>
@@ -284,7 +272,7 @@
         <w:pStyle w:val="ListBullet"/>
       </w:pPr>
       <w:r>
-        <w:t>• - Currency and Items: Players earn in-game currency (LexiCoins) and unique items (e.g., rare letters, magical sounds) that can be used for avatar customization or unlocking special features, enhancing Ownership &amp; Possession and Scarcity &amp; Impatience. (motivates Ownership &amp; Possession, Scarcity &amp; Impatience)</w:t>
+        <w:t>• - Cosmetic Items: Unlockable avatar accessories and decorations provide a sense of ownership and personalization (motivates Core Drive 4: Ownership &amp; Possession and Core Drive 3: Empowerment of Creativity &amp; Feedback).</w:t>
       </w:r>
     </w:p>
     <w:p>
@@ -292,7 +280,7 @@
         <w:pStyle w:val="ListBullet"/>
       </w:pPr>
       <w:r>
-        <w:t>• - Story Unlocks and Cinematics: Each island completion triggers an animated cinematic that visually transforms the environment, offering a rewarding visual and narrative payoff, reinforcing Epic Meaning &amp; Calling. (motivates Epic Meaning &amp; Calling)</w:t>
+        <w:t>• - Story Unlocks: Unlocking hidden stories and lore fragments deepens the narrative and provides a sense of discovery (motivates Core Drive 7: Unpredictability &amp; Curiosity and Core Drive 1: Epic Meaning &amp; Calling).</w:t>
       </w:r>
     </w:p>
     <w:p>
@@ -300,7 +288,7 @@
         <w:pStyle w:val="ListBullet"/>
       </w:pPr>
       <w:r>
-        <w:t>• - LexiLoot Boxes: Introduce loot boxes containing random avatar items or boosts, making the reward system more unpredictable and exciting. The appearance of these lootboxes can be made scarce, making the players more eager to open the boxes when they find them. (motivates Unpredictability &amp; Curiosity, Scarcity &amp; Impatience)</w:t>
+        <w:t>• - Rare Items: Special letters or sounds could be used to create powerful unique cosmetic items (motivates Core Drive 6: Scarcity &amp; Impatience).</w:t>
       </w:r>
     </w:p>
     <w:p>
@@ -316,7 +304,7 @@
         <w:pStyle w:val="ListBullet"/>
       </w:pPr>
       <w:r>
-        <w:t>• - Collaborative Puzzles: Islands feature puzzles that require multiple players to solve, fostering teamwork and communication. (supports Social Influence &amp; Relatedness)</w:t>
+        <w:t>• - Leaderboards: Showcasing top Explorer Levels and mini-game scores, fostering friendly competition (supports Core Drive 5: Social Influence &amp; Relatedness).</w:t>
       </w:r>
     </w:p>
     <w:p>
@@ -324,7 +312,7 @@
         <w:pStyle w:val="ListBullet"/>
       </w:pPr>
       <w:r>
-        <w:t>• - Shared Island Creation: Players can collaborate to build and decorate their own islands, showcasing their creativity and fostering a sense of community. (supports Empowerment of Creativity &amp; Feedback, Social Influence &amp; Relatedness)</w:t>
+        <w:t>• - Collaborative Mini-Games: Multiplayer challenges where players work together to solve language puzzles (supports Core Drive 5: Social Influence &amp; Relatedness).</w:t>
       </w:r>
     </w:p>
     <w:p>
@@ -332,7 +320,7 @@
         <w:pStyle w:val="ListBullet"/>
       </w:pPr>
       <w:r>
-        <w:t>• - Gifting System: Players can send gifts to friends, such as avatar items or LexiCoins, encouraging social interaction and reciprocity. (supports Social Influence &amp; Relatedness, Ownership &amp; Possession)</w:t>
+        <w:t>• - Shared World Map: A visual representation of Lexika where players can see other players' progress and accomplishments (supports Core Drive 5: Social Influence &amp; Relatedness).</w:t>
       </w:r>
     </w:p>
     <w:p>
@@ -340,15 +328,7 @@
         <w:pStyle w:val="ListBullet"/>
       </w:pPr>
       <w:r>
-        <w:t>• - Linguistic Duels: Challenge friends to French language quizzes to showcase your expertise. (supports Development &amp; Accomplishment, Social Influence &amp; Relatedness, Competitiveness)</w:t>
-      </w:r>
-    </w:p>
-    <w:p>
-      <w:pPr>
-        <w:pStyle w:val="ListBullet"/>
-      </w:pPr>
-      <w:r>
-        <w:t>• - Leaderboards: Display progress compared to friends (supports Social Influence &amp; Relatedness, Competitiveness)</w:t>
+        <w:t>• - Gifting: Enable players to send cosmetic items to one another. (supports Core Drive 5: Social Influence &amp; Relatedness).</w:t>
       </w:r>
     </w:p>
     <w:p>
@@ -370,43 +350,39 @@
     </w:p>
     <w:p>
       <w:r>
-        <w:t>The progression system is structured around the island-based exploration. Each island presents a series of mini-games and challenges that players must complete to "restore" that area of Lexika. The completion of each island unlocks new content, including:</w:t>
+        <w:t>The game utilizes a multi-layered progression system:</w:t>
         <w:br/>
-        <w:t>- New Islands: Unlocking new themed islands increases challenge and expands the learning scope. (Unpredictability &amp; Curiosity)</w:t>
+        <w:t>- **Island Completion:** Clearing each island unlocks new islands and story segments, fueling exploration (Core Drive 7: Unpredictability &amp; Curiosity).</w:t>
         <w:br/>
-        <w:t>- New Avatar Items: Avatar customization options are a tangible reward, increasing ownership. (Ownership &amp; Possession)</w:t>
+        <w:t>- **Skill Mastery:** Mini-games offer star ratings based on performance, encouraging improvement and mastery (Core Drive 2: Development &amp; Accomplishment).</w:t>
         <w:br/>
-        <w:t>- Explorer Rank: A visible rank (Beginner, Intermediate, Advanced, Master) reflects the player's overall progress and mastery. (Development &amp; Accomplishment)</w:t>
+        <w:t>- **Explorer Level:** Experience points earned from mini-games contribute to the player's Explorer Level, unlocking badges and titles (Beginner to Master) (Core Drive 2: Development &amp; Accomplishment).</w:t>
         <w:br/>
-        <w:t>- Story Unlocks: As players progress, they uncover hidden storylines and lore within Lexika, adding depth and Epic Meaning. (Epic Meaning &amp; Calling)</w:t>
+        <w:t>- **Collection &amp; Crafting:** Players collect letters, sounds, and words, which can be used to craft special items or unlock hidden content (Core Drive 4: Ownership &amp; Possession and Core Drive 3: Empowerment of Creativity &amp; Feedback).</w:t>
         <w:br/>
-        <w:t>- Daily Quests: Offer players daily goals (e.g. complete 3 mini-games), providing a consistent Development &amp; Accomplishment loop.</w:t>
-        <w:br/>
-        <w:t>- Timed Challenges: Introduce challenges with time limits, adding a "Loss &amp; Avoidance" element. Failing to complete within the time limit could result in temporary penalties, like losing bonus points.</w:t>
+        <w:t>- **Carnet de l’Explorateur Linguistique:** Players collect badges, objects and words to enrich and track progression. (Core Drive 2: Development &amp; Accomplishment)</w:t>
         <w:br/>
         <w:br/>
         <w:t>REWARD_SYSTEMS:</w:t>
         <w:br/>
-        <w:t>- Badges and Achievements: Awarded for completing specific tasks or reaching milestones, driving Development &amp; Accomplishment. (motivates Development &amp; Accomplishment)</w:t>
+        <w:t>- Badges and Titles: Awarded for achieving milestones and reaching new Explorer Levels, providing a sense of accomplishment and status (motivates Core Drive 2: Development &amp; Accomplishment).</w:t>
         <w:br/>
-        <w:t>- Currency and Items: Players earn in-game currency (LexiCoins) and unique items (e.g., rare letters, magical sounds) that can be used for avatar customization or unlocking special features, enhancing Ownership &amp; Possession and Scarcity &amp; Impatience. (motivates Ownership &amp; Possession, Scarcity &amp; Impatience)</w:t>
+        <w:t>- Cosmetic Items: Unlockable avatar accessories and decorations provide a sense of ownership and personalization (motivates Core Drive 4: Ownership &amp; Possession and Core Drive 3: Empowerment of Creativity &amp; Feedback).</w:t>
         <w:br/>
-        <w:t>- Story Unlocks and Cinematics: Each island completion triggers an animated cinematic that visually transforms the environment, offering a rewarding visual and narrative payoff, reinforcing Epic Meaning &amp; Calling. (motivates Epic Meaning &amp; Calling)</w:t>
+        <w:t>- Story Unlocks: Unlocking hidden stories and lore fragments deepens the narrative and provides a sense of discovery (motivates Core Drive 7: Unpredictability &amp; Curiosity and Core Drive 1: Epic Meaning &amp; Calling).</w:t>
         <w:br/>
-        <w:t>- LexiLoot Boxes: Introduce loot boxes containing random avatar items or boosts, making the reward system more unpredictable and exciting. The appearance of these lootboxes can be made scarce, making the players more eager to open the boxes when they find them. (motivates Unpredictability &amp; Curiosity, Scarcity &amp; Impatience)</w:t>
+        <w:t>- Rare Items: Special letters or sounds could be used to create powerful unique cosmetic items (motivates Core Drive 6: Scarcity &amp; Impatience).</w:t>
         <w:br/>
         <w:br/>
         <w:t>SOCIAL_ELEMENTS:</w:t>
         <w:br/>
-        <w:t>- Collaborative Puzzles: Islands feature puzzles that require multiple players to solve, fostering teamwork and communication. (supports Social Influence &amp; Relatedness)</w:t>
+        <w:t>- Leaderboards: Showcasing top Explorer Levels and mini-game scores, fostering friendly competition (supports Core Drive 5: Social Influence &amp; Relatedness).</w:t>
         <w:br/>
-        <w:t>- Shared Island Creation: Players can collaborate to build and decorate their own islands, showcasing their creativity and fostering a sense of community. (supports Empowerment of Creativity &amp; Feedback, Social Influence &amp; Relatedness)</w:t>
+        <w:t>- Collaborative Mini-Games: Multiplayer challenges where players work together to solve language puzzles (supports Core Drive 5: Social Influence &amp; Relatedness).</w:t>
         <w:br/>
-        <w:t>- Gifting System: Players can send gifts to friends, such as avatar items or LexiCoins, encouraging social interaction and reciprocity. (supports Social Influence &amp; Relatedness, Ownership &amp; Possession)</w:t>
+        <w:t>- Shared World Map: A visual representation of Lexika where players can see other players' progress and accomplishments (supports Core Drive 5: Social Influence &amp; Relatedness).</w:t>
         <w:br/>
-        <w:t>- Linguistic Duels: Challenge friends to French language quizzes to showcase your expertise. (supports Development &amp; Accomplishment, Social Influence &amp; Relatedness, Competitiveness)</w:t>
-        <w:br/>
-        <w:t>- Leaderboards: Display progress compared to friends (supports Social Influence &amp; Relatedness, Competitiveness)</w:t>
+        <w:t>- Gifting: Enable players to send cosmetic items to one another. (supports Core Drive 5: Social Influence &amp; Relatedness).</w:t>
         <w:br/>
         <w:br/>
         <w:t>PLAYER_JOURNEY:</w:t>
@@ -426,7 +402,7 @@
         <w:pStyle w:val="ListBullet"/>
       </w:pPr>
       <w:r>
-        <w:t>• - Badges and Achievements: Awarded for completing specific tasks or reaching milestones, driving Development &amp; Accomplishment. (motivates Development &amp; Accomplishment)</w:t>
+        <w:t>• - Badges and Titles: Awarded for achieving milestones and reaching new Explorer Levels, providing a sense of accomplishment and status (motivates Core Drive 2: Development &amp; Accomplishment).</w:t>
       </w:r>
     </w:p>
     <w:p>
@@ -434,7 +410,7 @@
         <w:pStyle w:val="ListBullet"/>
       </w:pPr>
       <w:r>
-        <w:t>• - Currency and Items: Players earn in-game currency (LexiCoins) and unique items (e.g., rare letters, magical sounds) that can be used for avatar customization or unlocking special features, enhancing Ownership &amp; Possession and Scarcity &amp; Impatience. (motivates Ownership &amp; Possession, Scarcity &amp; Impatience)</w:t>
+        <w:t>• - Cosmetic Items: Unlockable avatar accessories and decorations provide a sense of ownership and personalization (motivates Core Drive 4: Ownership &amp; Possession and Core Drive 3: Empowerment of Creativity &amp; Feedback).</w:t>
       </w:r>
     </w:p>
     <w:p>
@@ -442,7 +418,7 @@
         <w:pStyle w:val="ListBullet"/>
       </w:pPr>
       <w:r>
-        <w:t>• - Story Unlocks and Cinematics: Each island completion triggers an animated cinematic that visually transforms the environment, offering a rewarding visual and narrative payoff, reinforcing Epic Meaning &amp; Calling. (motivates Epic Meaning &amp; Calling)</w:t>
+        <w:t>• - Story Unlocks: Unlocking hidden stories and lore fragments deepens the narrative and provides a sense of discovery (motivates Core Drive 7: Unpredictability &amp; Curiosity and Core Drive 1: Epic Meaning &amp; Calling).</w:t>
       </w:r>
     </w:p>
     <w:p>
@@ -450,7 +426,7 @@
         <w:pStyle w:val="ListBullet"/>
       </w:pPr>
       <w:r>
-        <w:t>• - LexiLoot Boxes: Introduce loot boxes containing random avatar items or boosts, making the reward system more unpredictable and exciting. The appearance of these lootboxes can be made scarce, making the players more eager to open the boxes when they find them. (motivates Unpredictability &amp; Curiosity, Scarcity &amp; Impatience)</w:t>
+        <w:t>• - Rare Items: Special letters or sounds could be used to create powerful unique cosmetic items (motivates Core Drive 6: Scarcity &amp; Impatience).</w:t>
       </w:r>
     </w:p>
     <w:p>
@@ -466,7 +442,7 @@
         <w:pStyle w:val="ListBullet"/>
       </w:pPr>
       <w:r>
-        <w:t>• - Collaborative Puzzles: Islands feature puzzles that require multiple players to solve, fostering teamwork and communication. (supports Social Influence &amp; Relatedness)</w:t>
+        <w:t>• - Leaderboards: Showcasing top Explorer Levels and mini-game scores, fostering friendly competition (supports Core Drive 5: Social Influence &amp; Relatedness).</w:t>
       </w:r>
     </w:p>
     <w:p>
@@ -474,7 +450,7 @@
         <w:pStyle w:val="ListBullet"/>
       </w:pPr>
       <w:r>
-        <w:t>• - Shared Island Creation: Players can collaborate to build and decorate their own islands, showcasing their creativity and fostering a sense of community. (supports Empowerment of Creativity &amp; Feedback, Social Influence &amp; Relatedness)</w:t>
+        <w:t>• - Collaborative Mini-Games: Multiplayer challenges where players work together to solve language puzzles (supports Core Drive 5: Social Influence &amp; Relatedness).</w:t>
       </w:r>
     </w:p>
     <w:p>
@@ -482,7 +458,7 @@
         <w:pStyle w:val="ListBullet"/>
       </w:pPr>
       <w:r>
-        <w:t>• - Gifting System: Players can send gifts to friends, such as avatar items or LexiCoins, encouraging social interaction and reciprocity. (supports Social Influence &amp; Relatedness, Ownership &amp; Possession)</w:t>
+        <w:t>• - Shared World Map: A visual representation of Lexika where players can see other players' progress and accomplishments (supports Core Drive 5: Social Influence &amp; Relatedness).</w:t>
       </w:r>
     </w:p>
     <w:p>
@@ -490,15 +466,7 @@
         <w:pStyle w:val="ListBullet"/>
       </w:pPr>
       <w:r>
-        <w:t>• - Linguistic Duels: Challenge friends to French language quizzes to showcase your expertise. (supports Development &amp; Accomplishment, Social Influence &amp; Relatedness, Competitiveness)</w:t>
-      </w:r>
-    </w:p>
-    <w:p>
-      <w:pPr>
-        <w:pStyle w:val="ListBullet"/>
-      </w:pPr>
-      <w:r>
-        <w:t>• - Leaderboards: Display progress compared to friends (supports Social Influence &amp; Relatedness, Competitiveness)</w:t>
+        <w:t>• - Gifting: Enable players to send cosmetic items to one another. (supports Core Drive 5: Social Influence &amp; Relatedness).</w:t>
       </w:r>
     </w:p>
     <w:p>
@@ -523,7 +491,7 @@
         <w:pStyle w:val="ListBullet"/>
       </w:pPr>
       <w:r>
-        <w:t>• - Collaborative Puzzles: Islands feature puzzles that require multiple players to solve, fostering teamwork and communication. (supports Social Influence &amp; Relatedness)</w:t>
+        <w:t>• - Leaderboards: Showcasing top Explorer Levels and mini-game scores, fostering friendly competition (supports Core Drive 5: Social Influence &amp; Relatedness).</w:t>
       </w:r>
     </w:p>
     <w:p>
@@ -531,7 +499,7 @@
         <w:pStyle w:val="ListBullet"/>
       </w:pPr>
       <w:r>
-        <w:t>• - Shared Island Creation: Players can collaborate to build and decorate their own islands, showcasing their creativity and fostering a sense of community. (supports Empowerment of Creativity &amp; Feedback, Social Influence &amp; Relatedness)</w:t>
+        <w:t>• - Collaborative Mini-Games: Multiplayer challenges where players work together to solve language puzzles (supports Core Drive 5: Social Influence &amp; Relatedness).</w:t>
       </w:r>
     </w:p>
     <w:p>
@@ -539,7 +507,7 @@
         <w:pStyle w:val="ListBullet"/>
       </w:pPr>
       <w:r>
-        <w:t>• - Gifting System: Players can send gifts to friends, such as avatar items or LexiCoins, encouraging social interaction and reciprocity. (supports Social Influence &amp; Relatedness, Ownership &amp; Possession)</w:t>
+        <w:t>• - Shared World Map: A visual representation of Lexika where players can see other players' progress and accomplishments (supports Core Drive 5: Social Influence &amp; Relatedness).</w:t>
       </w:r>
     </w:p>
     <w:p>
@@ -547,15 +515,7 @@
         <w:pStyle w:val="ListBullet"/>
       </w:pPr>
       <w:r>
-        <w:t>• - Linguistic Duels: Challenge friends to French language quizzes to showcase your expertise. (supports Development &amp; Accomplishment, Social Influence &amp; Relatedness, Competitiveness)</w:t>
-      </w:r>
-    </w:p>
-    <w:p>
-      <w:pPr>
-        <w:pStyle w:val="ListBullet"/>
-      </w:pPr>
-      <w:r>
-        <w:t>• - Leaderboards: Display progress compared to friends (supports Social Influence &amp; Relatedness, Competitiveness)</w:t>
+        <w:t>• - Gifting: Enable players to send cosmetic items to one another. (supports Core Drive 5: Social Influence &amp; Relatedness).</w:t>
       </w:r>
     </w:p>
     <w:p>
@@ -589,7 +549,7 @@
         <w:pStyle w:val="ListBullet"/>
       </w:pPr>
       <w:r>
-        <w:t>• - App Store Optimization: Use relevant keywords like "French learning for kids," "dyslexia games," and "educational adventure" to improve visibility.</w:t>
+        <w:t>• - App Store/Steam Page: Eye-catching visuals, clear descriptions of educational benefits, and testimonials from parents and educators.</w:t>
       </w:r>
     </w:p>
     <w:p>
@@ -597,7 +557,7 @@
         <w:pStyle w:val="ListBullet"/>
       </w:pPr>
       <w:r>
-        <w:t>• - Engaging Trailer: Showcase the game's colorful visuals, captivating narrative, and dyslexia-friendly features in a short trailer.</w:t>
+        <w:t>• - Trailers: Short, engaging videos showcasing the game's world, characters, and mini-game variety.</w:t>
       </w:r>
     </w:p>
     <w:p>
@@ -605,7 +565,7 @@
         <w:pStyle w:val="ListBullet"/>
       </w:pPr>
       <w:r>
-        <w:t>• - Social Media Campaigns: Run targeted ads on social media platforms frequented by parents and educators, highlighting the game's educational benefits.</w:t>
+        <w:t>• - Social Media Campaigns: Targeted ads featuring relatable stories of children improving their French skills while having fun.</w:t>
       </w:r>
     </w:p>
     <w:p>
@@ -622,7 +582,7 @@
         <w:pStyle w:val="ListBullet"/>
       </w:pPr>
       <w:r>
-        <w:t>• - Interactive Tutorial: A friendly guide (e.g., Gardien Vokalys) introduces the core mechanics and narrative in a step-by-step tutorial.</w:t>
+        <w:t>• - Interactive Tutorial: A friendly character guides players through the basic mechanics and explains the game's story.</w:t>
       </w:r>
     </w:p>
     <w:p>
@@ -630,7 +590,7 @@
         <w:pStyle w:val="ListBullet"/>
       </w:pPr>
       <w:r>
-        <w:t>• - Simplified First Island: The initial island (Île des Voyelles) features simpler challenges to ease players into the game.</w:t>
+        <w:t>• - Adaptive Difficulty: Mini-games automatically adjust to the player's skill level, ensuring a challenging but not overwhelming experience.</w:t>
       </w:r>
     </w:p>
     <w:p>
@@ -638,7 +598,7 @@
         <w:pStyle w:val="ListBullet"/>
       </w:pPr>
       <w:r>
-        <w:t>• - Clear Objectives: Provide clear and concise instructions for each task, minimizing frustration and confusion.</w:t>
+        <w:t>• - Clear Progress Indicators: Visual cues and progress bars provide constant feedback on the player's progress.</w:t>
       </w:r>
     </w:p>
     <w:p>
@@ -655,7 +615,7 @@
         <w:pStyle w:val="ListBullet"/>
       </w:pPr>
       <w:r>
-        <w:t>• - Adaptive Difficulty: Adjust the difficulty of mini-games based on the player's performance, ensuring a balance between challenge and engagement.</w:t>
+        <w:t>• - Gradual Introduction of Concepts: Language skills are introduced sequentially, building on previous knowledge.</w:t>
       </w:r>
     </w:p>
     <w:p>
@@ -663,7 +623,7 @@
         <w:pStyle w:val="ListBullet"/>
       </w:pPr>
       <w:r>
-        <w:t>• - Hint System: Offer optional hints or clues within the mini-games, providing support without directly giving away the answers.</w:t>
+        <w:t>• - Hints and Tips: Available during mini-games to provide support without giving away the answer completely.</w:t>
       </w:r>
     </w:p>
     <w:p>
@@ -671,7 +631,7 @@
         <w:pStyle w:val="ListBullet"/>
       </w:pPr>
       <w:r>
-        <w:t>• - Personalized Feedback: Provide specific feedback on player performance, highlighting areas for improvement and reinforcing successful strategies.</w:t>
+        <w:t>• - Multi-Sensory Learning: Incorporating visual, auditory, and kinesthetic elements to cater to different learning styles.</w:t>
       </w:r>
     </w:p>
     <w:p>
@@ -688,7 +648,7 @@
         <w:pStyle w:val="ListBullet"/>
       </w:pPr>
       <w:r>
-        <w:t>• - Master Challenges: Introduce more complex linguistic puzzles and challenges that require a deep understanding of French grammar and vocabulary.</w:t>
+        <w:t>• - Completionist Challenges: Difficult optional challenges for players who want to achieve 100% completion.</w:t>
       </w:r>
     </w:p>
     <w:p>
@@ -696,7 +656,7 @@
         <w:pStyle w:val="ListBullet"/>
       </w:pPr>
       <w:r>
-        <w:t>• - Collaborative Storytelling: Allow players to create their own stories and quests within the Lexika universe, fostering community and creativity.</w:t>
+        <w:t>• - Daily Quests: Providing ongoing engagement and rewards for continued play.</w:t>
       </w:r>
     </w:p>
     <w:p>
@@ -704,23 +664,7 @@
         <w:pStyle w:val="ListBullet"/>
       </w:pPr>
       <w:r>
-        <w:t>• - Lexika Championship: Host regular competitions where players compete to earn exclusive rewards and recognition, driving long-term engagement.</w:t>
-      </w:r>
-    </w:p>
-    <w:p>
-      <w:pPr>
-        <w:pStyle w:val="ListBullet"/>
-      </w:pPr>
-      <w:r>
-        <w:t>• - New Islands: Add new islands as free downloadable content (DLC) to always keep the game fresh.</w:t>
-      </w:r>
-    </w:p>
-    <w:p>
-      <w:pPr>
-        <w:pStyle w:val="ListBullet"/>
-      </w:pPr>
-      <w:r>
-        <w:t>• - Language Exchange: Introduce opportunities to interact with French native speakers (with parental controls in place).</w:t>
+        <w:t>• - Community Events: Regular events with new challenges, rewards, and story content.</w:t>
       </w:r>
     </w:p>
     <w:p>
@@ -754,7 +698,7 @@
         <w:pStyle w:val="ListBullet"/>
       </w:pPr>
       <w:r>
-        <w:t>• - Achievement System: Offer a wide range of achievements that reward players for mastering specific skills and completing challenging tasks. (supports Development &amp; Accomplishment)</w:t>
+        <w:t>• - Extensive Badge Collection: A wide range of badges to unlock for completing specific achievements (supports Core Drive 2: Development &amp; Accomplishment).</w:t>
       </w:r>
     </w:p>
     <w:p>
@@ -762,7 +706,7 @@
         <w:pStyle w:val="ListBullet"/>
       </w:pPr>
       <w:r>
-        <w:t>• - Leaderboards: Display player rankings based on overall progress and performance, encouraging competition and striving for excellence. (supports Development &amp; Accomplishment, Competitiveness)</w:t>
+        <w:t>• - Leaderboard Rankings: Competitive leaderboards for mini-game scores and Explorer Level (supports Core Drive 2: Development &amp; Accomplishment).</w:t>
       </w:r>
     </w:p>
     <w:p>
@@ -779,7 +723,7 @@
         <w:pStyle w:val="ListBullet"/>
       </w:pPr>
       <w:r>
-        <w:t>• - Hidden Areas and Secrets: Populate the islands with hidden areas, secret passages, and Easter eggs to encourage exploration and discovery. (supports Unpredictability &amp; Curiosity)</w:t>
+        <w:t>• - Hidden Areas and Secrets: Discoverable areas with bonus content and lore fragments (supports Core Drive 7: Unpredictability &amp; Curiosity).</w:t>
       </w:r>
     </w:p>
     <w:p>
@@ -787,7 +731,7 @@
         <w:pStyle w:val="ListBullet"/>
       </w:pPr>
       <w:r>
-        <w:t>• - Lore and Backstory: Reveal a deeper backstory of the Lexika universe through collectible items, journal entries, and character dialogues, rewarding curiosity and exploration. (supports Epic Meaning &amp; Calling, Unpredictability &amp; Curiosity)</w:t>
+        <w:t>• - Branching Storylines: Multiple paths through the game with different endings and outcomes (supports Core Drive 7: Unpredictability &amp; Curiosity).</w:t>
       </w:r>
     </w:p>
     <w:p>
@@ -804,7 +748,7 @@
         <w:pStyle w:val="ListBullet"/>
       </w:pPr>
       <w:r>
-        <w:t>• - Cooperative Challenges: Design puzzles and quests that require players to work together, fostering teamwork and communication. (supports Social Influence &amp; Relatedness)</w:t>
+        <w:t>• - Collaborative Mini-Games: Opportunities to team up with other players to solve language puzzles (supports Core Drive 5: Social Influence &amp; Relatedness).</w:t>
       </w:r>
     </w:p>
     <w:p>
@@ -812,7 +756,7 @@
         <w:pStyle w:val="ListBullet"/>
       </w:pPr>
       <w:r>
-        <w:t>• - Community Events: Host regular in-game events that encourage players to interact and collaborate, such as shared island building or storytelling sessions. (supports Social Influence &amp; Relatedness, Empowerment of Creativity &amp; Feedback)</w:t>
+        <w:t>• - In-Game Chat: A safe and moderated chat system for players to communicate and share their experiences (supports Core Drive 5: Social Influence &amp; Relatedness).</w:t>
       </w:r>
     </w:p>
     <w:p>
@@ -847,7 +791,7 @@
         <w:pStyle w:val="ListBullet"/>
       </w:pPr>
       <w:r>
-        <w:t>• 1. Prototype: Develop a playable prototype focusing on the core mechanics and dyslexia-friendly features.</w:t>
+        <w:t>• 1. Prototype Phase: Focus on core mechanics and dyslexia support features.</w:t>
       </w:r>
     </w:p>
     <w:p>
@@ -855,7 +799,7 @@
         <w:pStyle w:val="ListBullet"/>
       </w:pPr>
       <w:r>
-        <w:t>• 2. Alpha: Conduct internal testing to identify and address any bugs or usability issues.</w:t>
+        <w:t>• 2. Content Creation Phase: Develop the game world, story, and mini-game content.</w:t>
       </w:r>
     </w:p>
     <w:p>
@@ -863,7 +807,7 @@
         <w:pStyle w:val="ListBullet"/>
       </w:pPr>
       <w:r>
-        <w:t>• 3. Beta: Release a beta version to a limited audience for feedback and refinement.</w:t>
+        <w:t>• 3. Testing and Refinement Phase: Conduct user testing with children with dyslexia and iterate on the design based on feedback.</w:t>
       </w:r>
     </w:p>
     <w:p>
@@ -871,7 +815,7 @@
         <w:pStyle w:val="ListBullet"/>
       </w:pPr>
       <w:r>
-        <w:t>• 4. Launch: Officially launch the game on Android, iOS, and PC platforms.</w:t>
+        <w:t>• 4. Social Integration Phase: Implement social features and online leaderboards.</w:t>
       </w:r>
     </w:p>
     <w:p>
@@ -879,7 +823,7 @@
         <w:pStyle w:val="ListBullet"/>
       </w:pPr>
       <w:r>
-        <w:t>• 5. Post-Launch Support: Continuously update the game with new content, features, and bug fixes based on player feedback.</w:t>
+        <w:t>• 5. Launch and Post-Launch Support Phase: Release the game on targeted platforms and provide ongoing updates and community support.</w:t>
       </w:r>
     </w:p>
     <w:p>
@@ -888,6 +832,14 @@
       </w:pPr>
       <w:r>
         <w:t>• ------</w:t>
+      </w:r>
+    </w:p>
+    <w:p>
+      <w:pPr>
+        <w:pStyle w:val="ListBullet"/>
+      </w:pPr>
+      <w:r>
+        <w:t>• ```</w:t>
       </w:r>
     </w:p>
     <w:sectPr>

</xml_diff>